<commit_message>
v2 paper: inline citations + keyed references; em-dash thinning, TOC after abstract; CBOM HKDF
</commit_message>
<xml_diff>
--- a/docs/WORKING-PAPER-v2.docx
+++ b/docs/WORKING-PAPER-v2.docx
@@ -2340,7 +2340,7 @@
         <w:t xml:space="preserve"> </w:t>
       </w:r>
       <w:r>
-        <w:t xml:space="preserve">tokens (object-capability security, the OAuth Transaction Tokens work)</w:t>
+        <w:t xml:space="preserve">tokens (object-capability security, the OAuth Transaction Tokens work [TxTokens])</w:t>
       </w:r>
       <w:r>
         <w:t xml:space="preserve"> </w:t>
@@ -2414,7 +2414,7 @@
         <w:t xml:space="preserve"> </w:t>
       </w:r>
       <w:r>
-        <w:t xml:space="preserve">what, a direct obstacle to obligations such as EU AI Act Article 14</w:t>
+        <w:t xml:space="preserve">what, a direct obstacle to obligations such as EU AI Act Article 14 [EU AI Act]</w:t>
       </w:r>
       <w:r>
         <w:t xml:space="preserve"> </w:t>
@@ -2428,7 +2428,7 @@
         <w:pStyle w:val="BodyText"/>
       </w:pPr>
       <w:r>
-        <w:t xml:space="preserve">A fourth pressure is now statutory. US Executive Order 14409,</w:t>
+        <w:t xml:space="preserve">A fourth pressure is now statutory. US Executive Order 14409 [EO 14409],</w:t>
       </w:r>
       <w:r>
         <w:t xml:space="preserve"> </w:t>
@@ -2467,7 +2467,7 @@
         <w:t xml:space="preserve"> </w:t>
       </w:r>
       <w:r>
-        <w:t xml:space="preserve">203/204/205), sets contractor deadlines (2030/2031), and directs CISA</w:t>
+        <w:t xml:space="preserve">203 [FIPS 203]/204 [FIPS 204]/205 [FIPS 205]), sets contractor deadlines (2030/2031), and directs CISA</w:t>
       </w:r>
       <w:r>
         <w:t xml:space="preserve"> </w:t>
@@ -2701,13 +2701,13 @@
         <w:t xml:space="preserve"> </w:t>
       </w:r>
       <w:r>
-        <w:t xml:space="preserve">resolution) analysed against centralized DNS, DNSSEC, ENS, and</w:t>
-      </w:r>
-      <w:r>
-        <w:t xml:space="preserve"> </w:t>
-      </w:r>
-      <w:r>
-        <w:t xml:space="preserve">Handshake.</w:t>
+        <w:t xml:space="preserve">resolution) analysed against centralized DNS, DNSSEC, ENS [ENS], and</w:t>
+      </w:r>
+      <w:r>
+        <w:t xml:space="preserve"> </w:t>
+      </w:r>
+      <w:r>
+        <w:t xml:space="preserve">Handshake [Handshake].</w:t>
       </w:r>
     </w:p>
     <w:p>
@@ -2800,13 +2800,13 @@
         <w:t xml:space="preserve"> </w:t>
       </w:r>
       <w:r>
-        <w:t xml:space="preserve">two-party privacy-preserving FATF Travel Rule deployment (IVMS101 +</w:t>
-      </w:r>
-      <w:r>
-        <w:t xml:space="preserve"> </w:t>
-      </w:r>
-      <w:r>
-        <w:t xml:space="preserve">SD-JWT + ZK over the OpenVASP Travel Rule Protocol),</w:t>
+        <w:t xml:space="preserve">two-party privacy-preserving FATF Travel Rule [FATF R.16] deployment (IVMS101 [IVMS101] +</w:t>
+      </w:r>
+      <w:r>
+        <w:t xml:space="preserve"> </w:t>
+      </w:r>
+      <w:r>
+        <w:t xml:space="preserve">SD-JWT [SD-JWT] + ZK over the OpenVASP Travel Rule Protocol [OpenVASP TRP]),</w:t>
       </w:r>
       <w:r>
         <w:t xml:space="preserve"> </w:t>
@@ -3039,13 +3039,13 @@
         <w:t xml:space="preserve"> </w:t>
       </w:r>
       <w:r>
-        <w:t xml:space="preserve">Credential [VC-DATA-MODEL], serialized as an SD-JWT VC</w:t>
-      </w:r>
-      <w:r>
-        <w:t xml:space="preserve"> </w:t>
-      </w:r>
-      <w:r>
-        <w:t xml:space="preserve">[SD-JWT-VC], issued once by a KYC provider after verifying the</w:t>
+        <w:t xml:space="preserve">Credential [VC-DATA-MODEL] [W3C-VC], serialized as an SD-JWT VC</w:t>
+      </w:r>
+      <w:r>
+        <w:t xml:space="preserve"> </w:t>
+      </w:r>
+      <w:r>
+        <w:t xml:space="preserve">[SD-JWT-VC] [SD-JWT-VC], issued once by a KYC provider after verifying the</w:t>
       </w:r>
       <w:r>
         <w:t xml:space="preserve"> </w:t>
@@ -3159,13 +3159,13 @@
         <w:t xml:space="preserve"> </w:t>
       </w:r>
       <w:r>
-        <w:t xml:space="preserve">A transaction token [TXN-TOKENS] bound to one</w:t>
-      </w:r>
-      <w:r>
-        <w:t xml:space="preserve"> </w:t>
-      </w:r>
-      <w:r>
-        <w:t xml:space="preserve">transaction context and sender-constrained per DPoP [RFC9449], ≈30</w:t>
+        <w:t xml:space="preserve">A transaction token [TXN-TOKENS] [TxTokens] bound to one</w:t>
+      </w:r>
+      <w:r>
+        <w:t xml:space="preserve"> </w:t>
+      </w:r>
+      <w:r>
+        <w:t xml:space="preserve">transaction context and sender-constrained per DPoP [RFC9449] [RFC 9449], ≈30</w:t>
       </w:r>
       <w:r>
         <w:t xml:space="preserve"> </w:t>
@@ -3503,7 +3503,7 @@
         <w:pStyle w:val="FirstParagraph"/>
       </w:pPr>
       <w:r>
-        <w:t xml:space="preserve">A conventional Decentralized Identifier [DID-CORE] is revealed during</w:t>
+        <w:t xml:space="preserve">A conventional Decentralized Identifier [DID-CORE] [W3C-DID] is revealed during</w:t>
       </w:r>
       <w:r>
         <w:t xml:space="preserve"> </w:t>
@@ -3615,7 +3615,7 @@
         <w:pStyle w:val="FirstParagraph"/>
       </w:pPr>
       <w:r>
-        <w:t xml:space="preserve">where H is the shared ZK-friendly hash (§5.2, Poseidon2), computed</w:t>
+        <w:t xml:space="preserve">where H is the shared ZK-friendly hash (§5.2, Poseidon2 [Poseidon2]), computed</w:t>
       </w:r>
       <w:r>
         <w:t xml:space="preserve"> </w:t>
@@ -3705,7 +3705,7 @@
         <w:t xml:space="preserve"> </w:t>
       </w:r>
       <w:r>
-        <w:t xml:space="preserve">commitments; BBS+; AnonCreds; zk-cred constructions), specialised to a</w:t>
+        <w:t xml:space="preserve">commitments; BBS+ [BBS+]; AnonCreds [AnonCreds]; zk-cred constructions), specialised to a</w:t>
       </w:r>
       <w:r>
         <w:t xml:space="preserve"> </w:t>
@@ -4423,13 +4423,16 @@
         <w:t xml:space="preserve">Travel Address</w:t>
       </w:r>
       <w:r>
-        <w:t xml:space="preserve">) or a centralized directory</w:t>
-      </w:r>
-      <w:r>
-        <w:t xml:space="preserve"> </w:t>
-      </w:r>
-      <w:r>
-        <w:t xml:space="preserve">(TRISA’s Global Directory Service, GDS). Both reintroduce a trust</w:t>
+        <w:t xml:space="preserve"> </w:t>
+      </w:r>
+      <w:r>
+        <w:t xml:space="preserve">[OpenVASP TRP]) or a centralized directory</w:t>
+      </w:r>
+      <w:r>
+        <w:t xml:space="preserve"> </w:t>
+      </w:r>
+      <w:r>
+        <w:t xml:space="preserve">(TRISA’s Global Directory Service, GDS) [TRISA]. Both reintroduce a trust</w:t>
       </w:r>
       <w:r>
         <w:t xml:space="preserve"> </w:t>
@@ -4503,7 +4506,7 @@
         <w:rPr>
           <w:b/>
         </w:rPr>
-        <w:t xml:space="preserve">DNSSEC.</w:t>
+        <w:t xml:space="preserve">DNSSEC [DNSSEC].</w:t>
       </w:r>
       <w:r>
         <w:t xml:space="preserve"> </w:t>
@@ -4577,7 +4580,7 @@
         <w:rPr>
           <w:b/>
         </w:rPr>
-        <w:t xml:space="preserve">ENS.</w:t>
+        <w:t xml:space="preserve">ENS [ENS].</w:t>
       </w:r>
       <w:r>
         <w:t xml:space="preserve"> </w:t>
@@ -4648,7 +4651,7 @@
         <w:rPr>
           <w:b/>
         </w:rPr>
-        <w:t xml:space="preserve">Handshake.</w:t>
+        <w:t xml:space="preserve">Handshake [Handshake].</w:t>
       </w:r>
       <w:r>
         <w:t xml:space="preserve"> </w:t>
@@ -4681,7 +4684,7 @@
         <w:rPr>
           <w:b/>
         </w:rPr>
-        <w:t xml:space="preserve">Namecoin</w:t>
+        <w:t xml:space="preserve">Namecoin [Namecoin]</w:t>
       </w:r>
       <w:r>
         <w:t xml:space="preserve"> </w:t>
@@ -4708,7 +4711,7 @@
         <w:t xml:space="preserve"> </w:t>
       </w:r>
       <w:r>
-        <w:t xml:space="preserve">ICANN’s OCTO-034 documents the real hazards of alternative name systems</w:t>
+        <w:t xml:space="preserve">ICANN’s OCTO-034 [OCTO-034] documents the real hazards of alternative name systems</w:t>
       </w:r>
       <w:r>
         <w:t xml:space="preserve"> </w:t>
@@ -4930,7 +4933,7 @@
         <w:t xml:space="preserve"> </w:t>
       </w:r>
       <w:r>
-        <w:t xml:space="preserve">DNS-over-HTTPS, RFC 9230) proxy / target separation, so no single server</w:t>
+        <w:t xml:space="preserve">DNS-over-HTTPS, RFC 9230) [RFC 9230] proxy / target separation, so no single server</w:t>
       </w:r>
       <w:r>
         <w:t xml:space="preserve"> </w:t>
@@ -4951,6 +4954,12 @@
         <w:t xml:space="preserve"> </w:t>
       </w:r>
       <w:r>
+        <w:t xml:space="preserve">[DECO]</w:t>
+      </w:r>
+      <w:r>
+        <w:t xml:space="preserve"> </w:t>
+      </w:r>
+      <w:r>
         <w:t xml:space="preserve">zero-knowledge lookup against the registry / oracle’s</w:t>
       </w:r>
       <w:r>
@@ -5229,7 +5238,7 @@
         <w:pStyle w:val="FirstParagraph"/>
       </w:pPr>
       <w:r>
-        <w:t xml:space="preserve">Three Groth16 predicate circuits prove compliance facts while revealing</w:t>
+        <w:t xml:space="preserve">Three Groth16 [Groth16] predicate circuits prove compliance facts while revealing</w:t>
       </w:r>
       <w:r>
         <w:t xml:space="preserve"> </w:t>
@@ -5352,16 +5361,16 @@
         <w:t xml:space="preserve"> </w:t>
       </w:r>
       <w:r>
-        <w:t xml:space="preserve">from MiMC to</w:t>
-      </w:r>
-      <w:r>
-        <w:t xml:space="preserve"> </w:t>
-      </w:r>
-      <w:r>
-        <w:rPr>
-          <w:b/>
-        </w:rPr>
-        <w:t xml:space="preserve">Poseidon2</w:t>
+        <w:t xml:space="preserve">from MiMC [MiMC] to</w:t>
+      </w:r>
+      <w:r>
+        <w:t xml:space="preserve"> </w:t>
+      </w:r>
+      <w:r>
+        <w:rPr>
+          <w:b/>
+        </w:rPr>
+        <w:t xml:space="preserve">Poseidon2 [Poseidon2]</w:t>
       </w:r>
       <w:r>
         <w:t xml:space="preserve"> </w:t>
@@ -5925,129 +5934,129 @@
         <w:rPr>
           <w:b/>
         </w:rPr>
+        <w:t xml:space="preserve">BLS12-381 [BLS12-381]</w:t>
+      </w:r>
+      <w:r>
+        <w:t xml:space="preserve"> </w:t>
+      </w:r>
+      <w:r>
+        <w:t xml:space="preserve">(~128-bit margin) costs roughly</w:t>
+      </w:r>
+      <w:r>
+        <w:t xml:space="preserve"> </w:t>
+      </w:r>
+      <w:r>
+        <w:rPr>
+          <w:b/>
+        </w:rPr>
+        <w:t xml:space="preserve">2× the prove and setup time and +49 %</w:t>
+      </w:r>
+      <w:r>
+        <w:rPr>
+          <w:b/>
+        </w:rPr>
+        <w:t xml:space="preserve"> </w:t>
+      </w:r>
+      <w:r>
+        <w:rPr>
+          <w:b/>
+        </w:rPr>
+        <w:t xml:space="preserve">proof size (164 → 244 B)</w:t>
+      </w:r>
+      <w:r>
+        <w:t xml:space="preserve"> </w:t>
+      </w:r>
+      <w:r>
+        <w:t xml:space="preserve">versus</w:t>
+      </w:r>
+      <w:r>
+        <w:t xml:space="preserve"> </w:t>
+      </w:r>
+      <w:r>
+        <w:rPr>
+          <w:b/>
+        </w:rPr>
+        <w:t xml:space="preserve">BN254 [BN254]</w:t>
+      </w:r>
+      <w:r>
+        <w:t xml:space="preserve"> </w:t>
+      </w:r>
+      <w:r>
+        <w:t xml:space="preserve">(~100-bit margin), with</w:t>
+      </w:r>
+      <w:r>
+        <w:t xml:space="preserve"> </w:t>
+      </w:r>
+      <w:r>
+        <w:t xml:space="preserve">~25 % slower verify. Because SPT-Txn proofs are</w:t>
+      </w:r>
+      <w:r>
+        <w:t xml:space="preserve"> </w:t>
+      </w:r>
+      <w:r>
+        <w:rPr>
+          <w:b/>
+        </w:rPr>
+        <w:t xml:space="preserve">ephemeral</w:t>
+      </w:r>
+      <w:r>
+        <w:t xml:space="preserve">, verified</w:t>
+      </w:r>
+      <w:r>
+        <w:t xml:space="preserve"> </w:t>
+      </w:r>
+      <w:r>
+        <w:t xml:space="preserve">once and discarded within the 30-second token lifetime, a ~100-bit</w:t>
+      </w:r>
+      <w:r>
+        <w:t xml:space="preserve"> </w:t>
+      </w:r>
+      <w:r>
+        <w:rPr>
+          <w:i/>
+        </w:rPr>
+        <w:t xml:space="preserve">classical</w:t>
+      </w:r>
+      <w:r>
+        <w:t xml:space="preserve"> </w:t>
+      </w:r>
+      <w:r>
+        <w:t xml:space="preserve">attack on a proof whose value has already expired is not a</w:t>
+      </w:r>
+      <w:r>
+        <w:t xml:space="preserve"> </w:t>
+      </w:r>
+      <w:r>
+        <w:t xml:space="preserve">realistic threat, and BN254 additionally offers EVM precompile</w:t>
+      </w:r>
+      <w:r>
+        <w:t xml:space="preserve"> </w:t>
+      </w:r>
+      <w:r>
+        <w:t xml:space="preserve">compatibility. We therefore default to</w:t>
+      </w:r>
+      <w:r>
+        <w:t xml:space="preserve"> </w:t>
+      </w:r>
+      <w:r>
+        <w:rPr>
+          <w:b/>
+        </w:rPr>
+        <w:t xml:space="preserve">BN254</w:t>
+      </w:r>
+      <w:r>
+        <w:t xml:space="preserve">, exposing</w:t>
+      </w:r>
+      <w:r>
+        <w:t xml:space="preserve"> </w:t>
+      </w:r>
+      <w:r>
+        <w:rPr>
+          <w:b/>
+        </w:rPr>
         <w:t xml:space="preserve">BLS12-381</w:t>
       </w:r>
       <w:r>
-        <w:t xml:space="preserve"> </w:t>
-      </w:r>
-      <w:r>
-        <w:t xml:space="preserve">(~128-bit margin) costs roughly</w:t>
-      </w:r>
-      <w:r>
-        <w:t xml:space="preserve"> </w:t>
-      </w:r>
-      <w:r>
-        <w:rPr>
-          <w:b/>
-        </w:rPr>
-        <w:t xml:space="preserve">2× the prove and setup time and +49 %</w:t>
-      </w:r>
-      <w:r>
-        <w:rPr>
-          <w:b/>
-        </w:rPr>
-        <w:t xml:space="preserve"> </w:t>
-      </w:r>
-      <w:r>
-        <w:rPr>
-          <w:b/>
-        </w:rPr>
-        <w:t xml:space="preserve">proof size (164 → 244 B)</w:t>
-      </w:r>
-      <w:r>
-        <w:t xml:space="preserve"> </w:t>
-      </w:r>
-      <w:r>
-        <w:t xml:space="preserve">versus</w:t>
-      </w:r>
-      <w:r>
-        <w:t xml:space="preserve"> </w:t>
-      </w:r>
-      <w:r>
-        <w:rPr>
-          <w:b/>
-        </w:rPr>
-        <w:t xml:space="preserve">BN254</w:t>
-      </w:r>
-      <w:r>
-        <w:t xml:space="preserve"> </w:t>
-      </w:r>
-      <w:r>
-        <w:t xml:space="preserve">(~100-bit margin), with</w:t>
-      </w:r>
-      <w:r>
-        <w:t xml:space="preserve"> </w:t>
-      </w:r>
-      <w:r>
-        <w:t xml:space="preserve">~25 % slower verify. Because SPT-Txn proofs are</w:t>
-      </w:r>
-      <w:r>
-        <w:t xml:space="preserve"> </w:t>
-      </w:r>
-      <w:r>
-        <w:rPr>
-          <w:b/>
-        </w:rPr>
-        <w:t xml:space="preserve">ephemeral</w:t>
-      </w:r>
-      <w:r>
-        <w:t xml:space="preserve">, verified</w:t>
-      </w:r>
-      <w:r>
-        <w:t xml:space="preserve"> </w:t>
-      </w:r>
-      <w:r>
-        <w:t xml:space="preserve">once and discarded within the 30-second token lifetime, a ~100-bit</w:t>
-      </w:r>
-      <w:r>
-        <w:t xml:space="preserve"> </w:t>
-      </w:r>
-      <w:r>
-        <w:rPr>
-          <w:i/>
-        </w:rPr>
-        <w:t xml:space="preserve">classical</w:t>
-      </w:r>
-      <w:r>
-        <w:t xml:space="preserve"> </w:t>
-      </w:r>
-      <w:r>
-        <w:t xml:space="preserve">attack on a proof whose value has already expired is not a</w:t>
-      </w:r>
-      <w:r>
-        <w:t xml:space="preserve"> </w:t>
-      </w:r>
-      <w:r>
-        <w:t xml:space="preserve">realistic threat, and BN254 additionally offers EVM precompile</w:t>
-      </w:r>
-      <w:r>
-        <w:t xml:space="preserve"> </w:t>
-      </w:r>
-      <w:r>
-        <w:t xml:space="preserve">compatibility. We therefore default to</w:t>
-      </w:r>
-      <w:r>
-        <w:t xml:space="preserve"> </w:t>
-      </w:r>
-      <w:r>
-        <w:rPr>
-          <w:b/>
-        </w:rPr>
-        <w:t xml:space="preserve">BN254</w:t>
-      </w:r>
-      <w:r>
-        <w:t xml:space="preserve">, exposing</w:t>
-      </w:r>
-      <w:r>
-        <w:t xml:space="preserve"> </w:t>
-      </w:r>
-      <w:r>
-        <w:rPr>
-          <w:b/>
-        </w:rPr>
-        <w:t xml:space="preserve">BLS12-381</w:t>
-      </w:r>
-      <w:r>
         <w:rPr>
           <w:b/>
         </w:rPr>
@@ -6138,7 +6147,7 @@
         <w:rPr>
           <w:b/>
         </w:rPr>
-        <w:t xml:space="preserve">PLONK</w:t>
+        <w:t xml:space="preserve">PLONK [PLONK]</w:t>
       </w:r>
       <w:r>
         <w:t xml:space="preserve">, whose universal</w:t>
@@ -6198,7 +6207,7 @@
         <w:rPr>
           <w:b/>
         </w:rPr>
-        <w:t xml:space="preserve">SD-JWT</w:t>
+        <w:t xml:space="preserve">SD-JWT [SD-JWT]</w:t>
       </w:r>
       <w:r>
         <w:t xml:space="preserve"> </w:t>
@@ -6276,7 +6285,7 @@
         <w:rPr>
           <w:b/>
         </w:rPr>
-        <w:t xml:space="preserve">FIPS 203 ML-KEM</w:t>
+        <w:t xml:space="preserve">FIPS 203 ML-KEM [FIPS 203]</w:t>
       </w:r>
       <w:r>
         <w:t xml:space="preserve">,</w:t>
@@ -6300,7 +6309,7 @@
         <w:rPr>
           <w:b/>
         </w:rPr>
-        <w:t xml:space="preserve">ML-DSA</w:t>
+        <w:t xml:space="preserve">ML-DSA [FIPS 204]</w:t>
       </w:r>
       <w:r>
         <w:t xml:space="preserve">,</w:t>
@@ -6312,7 +6321,7 @@
         <w:rPr>
           <w:b/>
         </w:rPr>
-        <w:t xml:space="preserve">FIPS 205 SLH-DSA</w:t>
+        <w:t xml:space="preserve">FIPS 205 SLH-DSA [FIPS 205]</w:t>
       </w:r>
       <w:r>
         <w:t xml:space="preserve">, and the accepted transition is</w:t>
@@ -6336,7 +6345,7 @@
         <w:t xml:space="preserve"> </w:t>
       </w:r>
       <w:r>
-        <w:t xml:space="preserve">14409 (2026-06-22) makes this a deadline-bearing federal mandate</w:t>
+        <w:t xml:space="preserve">14409 [EO 14409] (2026-06-22) makes this a deadline-bearing federal mandate</w:t>
       </w:r>
       <w:r>
         <w:t xml:space="preserve"> </w:t>
@@ -6675,13 +6684,13 @@
         <w:t xml:space="preserve"> </w:t>
       </w:r>
       <w:r>
-        <w:t xml:space="preserve">STARKs (hash-based, no trusted setup) and lattice SNARKs (LaBRADOR,</w:t>
-      </w:r>
-      <w:r>
-        <w:t xml:space="preserve"> </w:t>
-      </w:r>
-      <w:r>
-        <w:t xml:space="preserve">Greyhound), but in different toolchains, with larger proofs and far less</w:t>
+        <w:t xml:space="preserve">STARKs (hash-based, no trusted setup) and lattice SNARKs (LaBRADOR [LaBRADOR],</w:t>
+      </w:r>
+      <w:r>
+        <w:t xml:space="preserve"> </w:t>
+      </w:r>
+      <w:r>
+        <w:t xml:space="preserve">Greyhound [Greyhound]), but in different toolchains, with larger proofs and far less</w:t>
       </w:r>
       <w:r>
         <w:t xml:space="preserve"> </w:t>
@@ -6861,7 +6870,7 @@
         <w:pStyle w:val="FirstParagraph"/>
       </w:pPr>
       <w:r>
-        <w:t xml:space="preserve">The FATF Travel Rule (Recommendation 16) requires that originator and</w:t>
+        <w:t xml:space="preserve">The FATF Travel Rule (Recommendation 16) [FATF R.16] requires that originator and</w:t>
       </w:r>
       <w:r>
         <w:t xml:space="preserve"> </w:t>
@@ -6882,7 +6891,7 @@
         <w:rPr>
           <w:b/>
         </w:rPr>
-        <w:t xml:space="preserve">TRISA</w:t>
+        <w:t xml:space="preserve">TRISA [TRISA]</w:t>
       </w:r>
       <w:r>
         <w:t xml:space="preserve"> </w:t>
@@ -6903,7 +6912,7 @@
         <w:rPr>
           <w:b/>
         </w:rPr>
-        <w:t xml:space="preserve">OpenVASP TRP</w:t>
+        <w:t xml:space="preserve">OpenVASP TRP [OpenVASP TRP]</w:t>
       </w:r>
       <w:r>
         <w:t xml:space="preserve"> </w:t>
@@ -6915,7 +6924,7 @@
         <w:t xml:space="preserve"> </w:t>
       </w:r>
       <w:r>
-        <w:t xml:space="preserve">transport-level mTLS and ships the IVMS101 identity in cleartext to the</w:t>
+        <w:t xml:space="preserve">transport-level mTLS and ships the IVMS101 [IVMS101] identity in cleartext to the</w:t>
       </w:r>
       <w:r>
         <w:t xml:space="preserve"> </w:t>
@@ -6995,7 +7004,7 @@
         <w:rPr>
           <w:b/>
         </w:rPr>
-        <w:t xml:space="preserve">SD-JWT</w:t>
+        <w:t xml:space="preserve">SD-JWT [SD-JWT]</w:t>
       </w:r>
       <w:r>
         <w:t xml:space="preserve"> </w:t>
@@ -7495,7 +7504,7 @@
         <w:t xml:space="preserve"> </w:t>
       </w:r>
       <w:r>
-        <w:t xml:space="preserve">transaction context and sender-constrained (DPoP), so a captured</w:t>
+        <w:t xml:space="preserve">transaction context and sender-constrained (DPoP [RFC 9449]), so a captured</w:t>
       </w:r>
       <w:r>
         <w:t xml:space="preserve"> </w:t>
@@ -8008,7 +8017,7 @@
         <w:t xml:space="preserve"> </w:t>
       </w:r>
       <w:r>
-        <w:t xml:space="preserve">Verifiable Credentials / DID Core give user-controlled,</w:t>
+        <w:t xml:space="preserve">Verifiable Credentials [W3C-VC] / DID Core [W3C-DID] give user-controlled,</w:t>
       </w:r>
       <w:r>
         <w:t xml:space="preserve"> </w:t>
@@ -8032,13 +8041,13 @@
         <w:t xml:space="preserve"> </w:t>
       </w:r>
       <w:r>
-        <w:t xml:space="preserve">Transaction Tokens work gives transaction-scoped tokens but no</w:t>
-      </w:r>
-      <w:r>
-        <w:t xml:space="preserve"> </w:t>
-      </w:r>
-      <w:r>
-        <w:t xml:space="preserve">compliance semantics; anonymous credentials (BBS+, AnonCreds) and</w:t>
+        <w:t xml:space="preserve">Transaction Tokens work [TxTokens] gives transaction-scoped tokens but no</w:t>
+      </w:r>
+      <w:r>
+        <w:t xml:space="preserve"> </w:t>
+      </w:r>
+      <w:r>
+        <w:t xml:space="preserve">compliance semantics; anonymous credentials (BBS+ [BBS+], AnonCreds [AnonCreds]) and</w:t>
       </w:r>
       <w:r>
         <w:t xml:space="preserve"> </w:t>
@@ -8241,7 +8250,7 @@
         <w:t xml:space="preserve"> </w:t>
       </w:r>
       <w:r>
-        <w:t xml:space="preserve">defensible claim now that EO 14409 makes</w:t>
+        <w:t xml:space="preserve">defensible claim now that EO 14409 [EO 14409] makes</w:t>
       </w:r>
       <w:r>
         <w:t xml:space="preserve"> </w:t>
@@ -8377,7 +8386,7 @@
         <w:rPr>
           <w:b/>
         </w:rPr>
-        <w:t xml:space="preserve">IR 8587</w:t>
+        <w:t xml:space="preserve">IR 8587 [IR 8587]</w:t>
       </w:r>
       <w:r>
         <w:t xml:space="preserve"> </w:t>
@@ -8416,7 +8425,7 @@
         <w:rPr>
           <w:b/>
         </w:rPr>
-        <w:t xml:space="preserve">800-207</w:t>
+        <w:t xml:space="preserve">800-207 [SP 800-207]</w:t>
       </w:r>
       <w:r>
         <w:t xml:space="preserve"> </w:t>
@@ -8437,7 +8446,7 @@
         <w:rPr>
           <w:b/>
         </w:rPr>
-        <w:t xml:space="preserve">SP 800-204</w:t>
+        <w:t xml:space="preserve">SP 800-204 [SP 800-204]</w:t>
       </w:r>
       <w:r>
         <w:t xml:space="preserve"> </w:t>
@@ -8452,7 +8461,7 @@
         <w:rPr>
           <w:b/>
         </w:rPr>
-        <w:t xml:space="preserve">SP 800-63</w:t>
+        <w:t xml:space="preserve">SP 800-63 [SP 800-63-4]</w:t>
       </w:r>
       <w:r>
         <w:t xml:space="preserve"> </w:t>
@@ -8467,7 +8476,7 @@
         <w:rPr>
           <w:b/>
         </w:rPr>
-        <w:t xml:space="preserve">SP 800-162</w:t>
+        <w:t xml:space="preserve">SP 800-162 [SP 800-162]</w:t>
       </w:r>
       <w:r>
         <w:t xml:space="preserve"> </w:t>
@@ -8488,7 +8497,7 @@
         <w:rPr>
           <w:b/>
         </w:rPr>
-        <w:t xml:space="preserve">TRISA</w:t>
+        <w:t xml:space="preserve">TRISA [TRISA]</w:t>
       </w:r>
       <w:r>
         <w:t xml:space="preserve">,</w:t>
@@ -8500,7 +8509,7 @@
         <w:rPr>
           <w:b/>
         </w:rPr>
-        <w:t xml:space="preserve">OpenVASP TRP</w:t>
+        <w:t xml:space="preserve">OpenVASP TRP [OpenVASP TRP]</w:t>
       </w:r>
       <w:r>
         <w:t xml:space="preserve">,</w:t>
@@ -8518,7 +8527,7 @@
         <w:rPr>
           <w:b/>
         </w:rPr>
-        <w:t xml:space="preserve">IVMS101</w:t>
+        <w:t xml:space="preserve">IVMS101 [IVMS101]</w:t>
       </w:r>
       <w:r>
         <w:t xml:space="preserve">.</w:t>
@@ -8565,7 +8574,7 @@
         <w:rPr>
           <w:b/>
         </w:rPr>
-        <w:t xml:space="preserve">Securities (US Howey).</w:t>
+        <w:t xml:space="preserve">Securities (US Howey) [Howey].</w:t>
       </w:r>
       <w:r>
         <w:t xml:space="preserve"> </w:t>
@@ -8711,7 +8720,7 @@
         <w:t xml:space="preserve">”</w:t>
       </w:r>
       <w:r>
-        <w:t xml:space="preserve">), the safe structural boundary under FinCEN’s MSB framework and</w:t>
+        <w:t xml:space="preserve">), the safe structural boundary under FinCEN’s MSB framework [FinCEN MSB] and</w:t>
       </w:r>
       <w:r>
         <w:t xml:space="preserve"> </w:t>
@@ -8803,16 +8812,16 @@
         <w:t xml:space="preserve"> </w:t>
       </w:r>
       <w:r>
-        <w:t xml:space="preserve">(e.g. Cayman Islands under the VASP Act / CIMA) and</w:t>
-      </w:r>
-      <w:r>
-        <w:t xml:space="preserve"> </w:t>
-      </w:r>
-      <w:r>
-        <w:rPr>
-          <w:b/>
-        </w:rPr>
-        <w:t xml:space="preserve">MiCA CASP</w:t>
+        <w:t xml:space="preserve">(e.g. Cayman Islands under the VASP Act / CIMA [CIMA VASP]) and</w:t>
+      </w:r>
+      <w:r>
+        <w:t xml:space="preserve"> </w:t>
+      </w:r>
+      <w:r>
+        <w:rPr>
+          <w:b/>
+        </w:rPr>
+        <w:t xml:space="preserve">MiCA CASP [MiCA]</w:t>
       </w:r>
       <w:r>
         <w:t xml:space="preserve"> </w:t>
@@ -8871,7 +8880,7 @@
         <w:t xml:space="preserve"> </w:t>
       </w:r>
       <w:r>
-        <w:t xml:space="preserve">14 (effective human oversight, enforceable August 2026) requires and</w:t>
+        <w:t xml:space="preserve">14 [EU AI Act] (effective human oversight, enforceable August 2026) requires and</w:t>
       </w:r>
       <w:r>
         <w:t xml:space="preserve"> </w:t>
@@ -8894,13 +8903,13 @@
         <w:t xml:space="preserve"> </w:t>
       </w:r>
       <w:r>
-        <w:t xml:space="preserve">US Executive Order 14409 (2026) mandates PQC</w:t>
-      </w:r>
-      <w:r>
-        <w:t xml:space="preserve"> </w:t>
-      </w:r>
-      <w:r>
-        <w:t xml:space="preserve">migration (FIPS 203/204/205) and CBOM guidance; SPT-Txn’s crypto-agility</w:t>
+        <w:t xml:space="preserve">US Executive Order 14409 [EO 14409] (2026) mandates PQC</w:t>
+      </w:r>
+      <w:r>
+        <w:t xml:space="preserve"> </w:t>
+      </w:r>
+      <w:r>
+        <w:t xml:space="preserve">migration (FIPS 203 [FIPS 203]/204 [FIPS 204]/205 [FIPS 205]) and CBOM guidance; SPT-Txn’s crypto-agility</w:t>
       </w:r>
       <w:r>
         <w:t xml:space="preserve"> </w:t>
@@ -9384,28 +9393,28 @@
         <w:t xml:space="preserve"> </w:t>
       </w:r>
       <w:r>
-        <w:t xml:space="preserve">Poseidon2; Ed25519/X25519/ECIES;</w:t>
-      </w:r>
-      <w:r>
-        <w:t xml:space="preserve"> </w:t>
-      </w:r>
-      <w:r>
-        <w:rPr>
-          <w:b/>
-        </w:rPr>
-        <w:t xml:space="preserve">ML-KEM (FIPS 203) / ML-DSA (FIPS</w:t>
-      </w:r>
-      <w:r>
-        <w:rPr>
-          <w:b/>
-        </w:rPr>
-        <w:t xml:space="preserve"> </w:t>
-      </w:r>
-      <w:r>
-        <w:rPr>
-          <w:b/>
-        </w:rPr>
-        <w:t xml:space="preserve">204)</w:t>
+        <w:t xml:space="preserve">Poseidon2 [Poseidon2]; Ed25519/X25519/ECIES;</w:t>
+      </w:r>
+      <w:r>
+        <w:t xml:space="preserve"> </w:t>
+      </w:r>
+      <w:r>
+        <w:rPr>
+          <w:b/>
+        </w:rPr>
+        <w:t xml:space="preserve">ML-KEM (FIPS 203) [FIPS 203] / ML-DSA (FIPS</w:t>
+      </w:r>
+      <w:r>
+        <w:rPr>
+          <w:b/>
+        </w:rPr>
+        <w:t xml:space="preserve"> </w:t>
+      </w:r>
+      <w:r>
+        <w:rPr>
+          <w:b/>
+        </w:rPr>
+        <w:t xml:space="preserve">204) [FIPS 204]</w:t>
       </w:r>
       <w:r>
         <w:t xml:space="preserve">; fuzzy extractors + nullifiers;</w:t>
@@ -9417,7 +9426,7 @@
         <w:rPr>
           <w:b/>
         </w:rPr>
-        <w:t xml:space="preserve">FATF Recommendation 16</w:t>
+        <w:t xml:space="preserve">FATF Recommendation 16 [FATF R.16]</w:t>
       </w:r>
       <w:r>
         <w:t xml:space="preserve"> </w:t>
@@ -9432,7 +9441,7 @@
         <w:rPr>
           <w:b/>
         </w:rPr>
-        <w:t xml:space="preserve">IVMS101</w:t>
+        <w:t xml:space="preserve">IVMS101 [IVMS101]</w:t>
       </w:r>
       <w:r>
         <w:t xml:space="preserve">; OpenID4VCI for issuance. Aligns with</w:t>
@@ -9456,7 +9465,7 @@
         <w:rPr>
           <w:b/>
         </w:rPr>
-        <w:t xml:space="preserve">BCP (RFC 9700)</w:t>
+        <w:t xml:space="preserve">BCP (RFC 9700) [RFC 9700]</w:t>
       </w:r>
       <w:r>
         <w:t xml:space="preserve">,</w:t>
@@ -9468,7 +9477,7 @@
         <w:rPr>
           <w:b/>
         </w:rPr>
-        <w:t xml:space="preserve">NIST IR 8587</w:t>
+        <w:t xml:space="preserve">NIST IR 8587 [IR 8587]</w:t>
       </w:r>
       <w:r>
         <w:t xml:space="preserve">, and</w:t>
@@ -9480,7 +9489,7 @@
         <w:rPr>
           <w:b/>
         </w:rPr>
-        <w:t xml:space="preserve">SP 800-63</w:t>
+        <w:t xml:space="preserve">SP 800-63 [SP 800-63-4]</w:t>
       </w:r>
       <w:r>
         <w:t xml:space="preserve">. (Full table and</w:t>
@@ -9629,13 +9638,13 @@
         <w:rPr>
           <w:b/>
         </w:rPr>
-        <w:t xml:space="preserve">live two-party FATF Travel Rule</w:t>
-      </w:r>
-      <w:r>
-        <w:t xml:space="preserve"> </w:t>
-      </w:r>
-      <w:r>
-        <w:t xml:space="preserve">exchange over OpenVASP TRP carrying</w:t>
+        <w:t xml:space="preserve">live two-party FATF Travel Rule [FATF R.16]</w:t>
+      </w:r>
+      <w:r>
+        <w:t xml:space="preserve"> </w:t>
+      </w:r>
+      <w:r>
+        <w:t xml:space="preserve">exchange over OpenVASP TRP [OpenVASP TRP] carrying</w:t>
       </w:r>
       <w:r>
         <w:t xml:space="preserve"> </w:t>
@@ -9665,7 +9674,7 @@
         <w:t xml:space="preserve"> </w:t>
       </w:r>
       <w:r>
-        <w:t xml:space="preserve">US Executive Order 14409.</w:t>
+        <w:t xml:space="preserve">US Executive Order 14409 [EO 14409].</w:t>
       </w:r>
     </w:p>
     <w:p>
@@ -9754,13 +9763,13 @@
         <w:t xml:space="preserve"> </w:t>
       </w:r>
       <w:r>
-        <w:t xml:space="preserve">IETF (an OAuth Transaction Tokens extension), NIST engagement (IR 8587,</w:t>
-      </w:r>
-      <w:r>
-        <w:t xml:space="preserve"> </w:t>
-      </w:r>
-      <w:r>
-        <w:t xml:space="preserve">SP 800-207/204/63/162), and the FATF Travel Rule ecosystem.</w:t>
+        <w:t xml:space="preserve">IETF (an OAuth Transaction Tokens extension [TxTokens]), NIST engagement (IR 8587 [IR 8587],</w:t>
+      </w:r>
+      <w:r>
+        <w:t xml:space="preserve"> </w:t>
+      </w:r>
+      <w:r>
+        <w:t xml:space="preserve">SP 800-207 [SP 800-207]/204 [SP 800-204]/63 [SP 800-63-4]/162 [SP 800-162]), and the FATF Travel Rule ecosystem.</w:t>
       </w:r>
     </w:p>
     <w:p>
@@ -9782,6 +9791,15 @@
         <w:pStyle w:val="Compact"/>
       </w:pPr>
       <w:r>
+        <w:rPr>
+          <w:b/>
+        </w:rPr>
+        <w:t xml:space="preserve">[W3C-VC]</w:t>
+      </w:r>
+      <w:r>
+        <w:t xml:space="preserve"> </w:t>
+      </w:r>
+      <w:r>
         <w:t xml:space="preserve">W3C</w:t>
       </w:r>
       <w:r>
@@ -9801,21 +9819,18 @@
       </w:r>
       <w:r>
         <w:rPr>
+          <w:b/>
+        </w:rPr>
+        <w:t xml:space="preserve">[W3C-DID]</w:t>
+      </w:r>
+      <w:r>
+        <w:t xml:space="preserve"> </w:t>
+      </w:r>
+      <w:r>
+        <w:rPr>
           <w:i/>
         </w:rPr>
-        <w:t xml:space="preserve">Decentralized</w:t>
-      </w:r>
-      <w:r>
-        <w:rPr>
-          <w:i/>
-        </w:rPr>
-        <w:t xml:space="preserve"> </w:t>
-      </w:r>
-      <w:r>
-        <w:rPr>
-          <w:i/>
-        </w:rPr>
-        <w:t xml:space="preserve">Identifiers (DID) Core 1.0</w:t>
+        <w:t xml:space="preserve">Decentralized Identifiers (DID) Core 1.0</w:t>
       </w:r>
       <w:r>
         <w:t xml:space="preserve">.</w:t>
@@ -9830,6 +9845,15 @@
         <w:pStyle w:val="Compact"/>
       </w:pPr>
       <w:r>
+        <w:rPr>
+          <w:b/>
+        </w:rPr>
+        <w:t xml:space="preserve">[SD-JWT]</w:t>
+      </w:r>
+      <w:r>
+        <w:t xml:space="preserve"> </w:t>
+      </w:r>
+      <w:r>
         <w:t xml:space="preserve">IETF</w:t>
       </w:r>
       <w:r>
@@ -9852,21 +9876,78 @@
       </w:r>
       <w:r>
         <w:rPr>
+          <w:b/>
+        </w:rPr>
+        <w:t xml:space="preserve">[SD-JWT-VC]</w:t>
+      </w:r>
+      <w:r>
+        <w:t xml:space="preserve"> </w:t>
+      </w:r>
+      <w:r>
+        <w:rPr>
           <w:i/>
         </w:rPr>
-        <w:t xml:space="preserve">SD-JWT-based</w:t>
+        <w:t xml:space="preserve">SD-JWT-based Verifiable Credentials (SD-JWT VC)</w:t>
+      </w:r>
+      <w:r>
+        <w:t xml:space="preserve">;</w:t>
+      </w:r>
+      <w:r>
+        <w:t xml:space="preserve"> </w:t>
+      </w:r>
+      <w:r>
+        <w:rPr>
+          <w:b/>
+        </w:rPr>
+        <w:t xml:space="preserve">[TxTokens]</w:t>
+      </w:r>
+      <w:r>
+        <w:t xml:space="preserve"> </w:t>
       </w:r>
       <w:r>
         <w:rPr>
           <w:i/>
         </w:rPr>
+        <w:t xml:space="preserve">OAuth 2.0 Transaction Tokens</w:t>
+      </w:r>
+      <w:r>
+        <w:t xml:space="preserve"> </w:t>
+      </w:r>
+      <w:r>
+        <w:t xml:space="preserve">(</w:t>
+      </w:r>
+      <w:r>
+        <w:rPr>
+          <w:rStyle w:val="VerbatimChar"/>
+        </w:rPr>
+        <w:t xml:space="preserve">draft-ietf-oauth-transaction-tokens</w:t>
+      </w:r>
+      <w:r>
+        <w:t xml:space="preserve">);</w:t>
+      </w:r>
+      <w:r>
+        <w:t xml:space="preserve"> </w:t>
+      </w:r>
+      <w:r>
+        <w:rPr>
+          <w:b/>
+        </w:rPr>
+        <w:t xml:space="preserve">[RFC 9449]</w:t>
+      </w:r>
+      <w:r>
+        <w:t xml:space="preserve"> </w:t>
+      </w:r>
+      <w:r>
+        <w:t xml:space="preserve">RFC 9449</w:t>
+      </w:r>
+      <w:r>
         <w:t xml:space="preserve"> </w:t>
       </w:r>
       <w:r>
         <w:rPr>
           <w:i/>
         </w:rPr>
-        <w:t xml:space="preserve">Verifiable Credentials (SD-JWT VC)</w:t>
+        <w:t xml:space="preserve">DPoP</w:t>
       </w:r>
       <w:r>
         <w:t xml:space="preserve">;</w:t>
@@ -9876,33 +9957,24 @@
       </w:r>
       <w:r>
         <w:rPr>
+          <w:b/>
+        </w:rPr>
+        <w:t xml:space="preserve">[RFC 9700]</w:t>
+      </w:r>
+      <w:r>
+        <w:t xml:space="preserve"> </w:t>
+      </w:r>
+      <w:r>
+        <w:t xml:space="preserve">RFC 9700</w:t>
+      </w:r>
+      <w:r>
+        <w:t xml:space="preserve"> </w:t>
+      </w:r>
+      <w:r>
+        <w:rPr>
           <w:i/>
         </w:rPr>
-        <w:t xml:space="preserve">OAuth 2.0 Transaction Tokens</w:t>
-      </w:r>
-      <w:r>
-        <w:t xml:space="preserve"> </w:t>
-      </w:r>
-      <w:r>
-        <w:t xml:space="preserve">(</w:t>
-      </w:r>
-      <w:r>
-        <w:rPr>
-          <w:rStyle w:val="VerbatimChar"/>
-        </w:rPr>
-        <w:t xml:space="preserve">draft-ietf-oauth-transaction-tokens</w:t>
-      </w:r>
-      <w:r>
-        <w:t xml:space="preserve">); RFC 9449</w:t>
-      </w:r>
-      <w:r>
-        <w:t xml:space="preserve"> </w:t>
-      </w:r>
-      <w:r>
-        <w:rPr>
-          <w:i/>
-        </w:rPr>
-        <w:t xml:space="preserve">DPoP</w:t>
+        <w:t xml:space="preserve">OAuth 2.0 Security Best Current Practice</w:t>
       </w:r>
       <w:r>
         <w:t xml:space="preserve">;</w:t>
@@ -9911,19 +9983,16 @@
         <w:t xml:space="preserve"> </w:t>
       </w:r>
       <w:r>
-        <w:t xml:space="preserve">RFC 9700</w:t>
-      </w:r>
-      <w:r>
-        <w:t xml:space="preserve"> </w:t>
-      </w:r>
-      <w:r>
-        <w:rPr>
-          <w:i/>
-        </w:rPr>
-        <w:t xml:space="preserve">OAuth 2.0 Security Best Current Practice</w:t>
-      </w:r>
-      <w:r>
-        <w:t xml:space="preserve">; RFC 9230</w:t>
+        <w:rPr>
+          <w:b/>
+        </w:rPr>
+        <w:t xml:space="preserve">[RFC 9230]</w:t>
+      </w:r>
+      <w:r>
+        <w:t xml:space="preserve"> </w:t>
+      </w:r>
+      <w:r>
+        <w:t xml:space="preserve">RFC 9230</w:t>
       </w:r>
       <w:r>
         <w:t xml:space="preserve"> </w:t>
@@ -9947,6 +10016,15 @@
         <w:pStyle w:val="Compact"/>
       </w:pPr>
       <w:r>
+        <w:rPr>
+          <w:b/>
+        </w:rPr>
+        <w:t xml:space="preserve">[IR 8587]</w:t>
+      </w:r>
+      <w:r>
+        <w:t xml:space="preserve"> </w:t>
+      </w:r>
+      <w:r>
         <w:t xml:space="preserve">NIST</w:t>
       </w:r>
       <w:r>
@@ -9962,31 +10040,121 @@
         <w:t xml:space="preserve"> </w:t>
       </w:r>
       <w:r>
-        <w:t xml:space="preserve">(Protecting Tokens and Assertions from Forgery,</w:t>
-      </w:r>
-      <w:r>
-        <w:t xml:space="preserve"> </w:t>
-      </w:r>
-      <w:r>
-        <w:t xml:space="preserve">Theft, and Misuse); SP 800-207 / 800-207A (Zero Trust Architecture);</w:t>
-      </w:r>
-      <w:r>
-        <w:t xml:space="preserve"> </w:t>
-      </w:r>
-      <w:r>
-        <w:t xml:space="preserve">SP 800-204 A/B/C (Microservices); SP 800-63-4 (Digital Identity); SP</w:t>
-      </w:r>
-      <w:r>
-        <w:t xml:space="preserve"> </w:t>
-      </w:r>
-      <w:r>
-        <w:t xml:space="preserve">800-162 (ABAC); SP 800-57 (Key Management); SP 800-133r3 (Key</w:t>
-      </w:r>
-      <w:r>
-        <w:t xml:space="preserve"> </w:t>
-      </w:r>
-      <w:r>
-        <w:t xml:space="preserve">Generation).</w:t>
+        <w:t xml:space="preserve">(Protecting Tokens and Assertions from</w:t>
+      </w:r>
+      <w:r>
+        <w:t xml:space="preserve"> </w:t>
+      </w:r>
+      <w:r>
+        <w:t xml:space="preserve">Forgery, Theft, and Misuse);</w:t>
+      </w:r>
+      <w:r>
+        <w:t xml:space="preserve"> </w:t>
+      </w:r>
+      <w:r>
+        <w:rPr>
+          <w:b/>
+        </w:rPr>
+        <w:t xml:space="preserve">[SP 800-207]</w:t>
+      </w:r>
+      <w:r>
+        <w:t xml:space="preserve"> </w:t>
+      </w:r>
+      <w:r>
+        <w:t xml:space="preserve">SP 800-207 / 800-207A</w:t>
+      </w:r>
+      <w:r>
+        <w:t xml:space="preserve"> </w:t>
+      </w:r>
+      <w:r>
+        <w:t xml:space="preserve">(Zero Trust Architecture);</w:t>
+      </w:r>
+      <w:r>
+        <w:t xml:space="preserve"> </w:t>
+      </w:r>
+      <w:r>
+        <w:rPr>
+          <w:b/>
+        </w:rPr>
+        <w:t xml:space="preserve">[SP 800-204]</w:t>
+      </w:r>
+      <w:r>
+        <w:t xml:space="preserve"> </w:t>
+      </w:r>
+      <w:r>
+        <w:t xml:space="preserve">SP 800-204 A/B/C</w:t>
+      </w:r>
+      <w:r>
+        <w:t xml:space="preserve"> </w:t>
+      </w:r>
+      <w:r>
+        <w:t xml:space="preserve">(Microservices);</w:t>
+      </w:r>
+      <w:r>
+        <w:t xml:space="preserve"> </w:t>
+      </w:r>
+      <w:r>
+        <w:rPr>
+          <w:b/>
+        </w:rPr>
+        <w:t xml:space="preserve">[SP 800-63-4]</w:t>
+      </w:r>
+      <w:r>
+        <w:t xml:space="preserve"> </w:t>
+      </w:r>
+      <w:r>
+        <w:t xml:space="preserve">SP 800-63-4 (Digital Identity);</w:t>
+      </w:r>
+      <w:r>
+        <w:t xml:space="preserve"> </w:t>
+      </w:r>
+      <w:r>
+        <w:rPr>
+          <w:b/>
+        </w:rPr>
+        <w:t xml:space="preserve">[SP 800-162]</w:t>
+      </w:r>
+      <w:r>
+        <w:t xml:space="preserve"> </w:t>
+      </w:r>
+      <w:r>
+        <w:t xml:space="preserve">SP 800-162 (ABAC);</w:t>
+      </w:r>
+      <w:r>
+        <w:t xml:space="preserve"> </w:t>
+      </w:r>
+      <w:r>
+        <w:rPr>
+          <w:b/>
+        </w:rPr>
+        <w:t xml:space="preserve">[SP 800-57]</w:t>
+      </w:r>
+      <w:r>
+        <w:t xml:space="preserve"> </w:t>
+      </w:r>
+      <w:r>
+        <w:t xml:space="preserve">SP 800-57 (Key</w:t>
+      </w:r>
+      <w:r>
+        <w:t xml:space="preserve"> </w:t>
+      </w:r>
+      <w:r>
+        <w:t xml:space="preserve">Management);</w:t>
+      </w:r>
+      <w:r>
+        <w:t xml:space="preserve"> </w:t>
+      </w:r>
+      <w:r>
+        <w:rPr>
+          <w:b/>
+        </w:rPr>
+        <w:t xml:space="preserve">[SP 800-133]</w:t>
+      </w:r>
+      <w:r>
+        <w:t xml:space="preserve"> </w:t>
+      </w:r>
+      <w:r>
+        <w:t xml:space="preserve">SP 800-133r3 (Key Generation).</w:t>
       </w:r>
     </w:p>
     <w:p>
@@ -9998,6 +10166,15 @@
         <w:pStyle w:val="Compact"/>
       </w:pPr>
       <w:r>
+        <w:rPr>
+          <w:b/>
+        </w:rPr>
+        <w:t xml:space="preserve">[FIPS 203]</w:t>
+      </w:r>
+      <w:r>
+        <w:t xml:space="preserve"> </w:t>
+      </w:r>
+      <w:r>
         <w:t xml:space="preserve">NIST FIPS 203</w:t>
       </w:r>
       <w:r>
@@ -10010,7 +10187,22 @@
         <w:t xml:space="preserve">ML-KEM</w:t>
       </w:r>
       <w:r>
-        <w:t xml:space="preserve">; FIPS 204</w:t>
+        <w:t xml:space="preserve">;</w:t>
+      </w:r>
+      <w:r>
+        <w:t xml:space="preserve"> </w:t>
+      </w:r>
+      <w:r>
+        <w:rPr>
+          <w:b/>
+        </w:rPr>
+        <w:t xml:space="preserve">[FIPS 204]</w:t>
+      </w:r>
+      <w:r>
+        <w:t xml:space="preserve"> </w:t>
+      </w:r>
+      <w:r>
+        <w:t xml:space="preserve">FIPS 204</w:t>
       </w:r>
       <w:r>
         <w:t xml:space="preserve"> </w:t>
@@ -10022,7 +10214,22 @@
         <w:t xml:space="preserve">ML-DSA</w:t>
       </w:r>
       <w:r>
-        <w:t xml:space="preserve">; FIPS 205</w:t>
+        <w:t xml:space="preserve">;</w:t>
+      </w:r>
+      <w:r>
+        <w:t xml:space="preserve"> </w:t>
+      </w:r>
+      <w:r>
+        <w:rPr>
+          <w:b/>
+        </w:rPr>
+        <w:t xml:space="preserve">[FIPS 205]</w:t>
+      </w:r>
+      <w:r>
+        <w:t xml:space="preserve"> </w:t>
+      </w:r>
+      <w:r>
+        <w:t xml:space="preserve">FIPS 205</w:t>
       </w:r>
       <w:r>
         <w:t xml:space="preserve"> </w:t>
@@ -10046,6 +10253,15 @@
         <w:pStyle w:val="Compact"/>
       </w:pPr>
       <w:r>
+        <w:rPr>
+          <w:b/>
+        </w:rPr>
+        <w:t xml:space="preserve">[FATF R.16]</w:t>
+      </w:r>
+      <w:r>
+        <w:t xml:space="preserve"> </w:t>
+      </w:r>
+      <w:r>
         <w:t xml:space="preserve">FATF</w:t>
       </w:r>
       <w:r>
@@ -10061,7 +10277,22 @@
         <w:t xml:space="preserve"> </w:t>
       </w:r>
       <w:r>
-        <w:t xml:space="preserve">(Travel Rule); interVASP</w:t>
+        <w:t xml:space="preserve">(Travel Rule);</w:t>
+      </w:r>
+      <w:r>
+        <w:t xml:space="preserve"> </w:t>
+      </w:r>
+      <w:r>
+        <w:rPr>
+          <w:b/>
+        </w:rPr>
+        <w:t xml:space="preserve">[IVMS101]</w:t>
+      </w:r>
+      <w:r>
+        <w:t xml:space="preserve"> </w:t>
+      </w:r>
+      <w:r>
+        <w:t xml:space="preserve">interVASP</w:t>
       </w:r>
       <w:r>
         <w:t xml:space="preserve"> </w:t>
@@ -10073,7 +10304,31 @@
         <w:t xml:space="preserve">IVMS101</w:t>
       </w:r>
       <w:r>
-        <w:t xml:space="preserve">; TRISA;</w:t>
+        <w:t xml:space="preserve">;</w:t>
+      </w:r>
+      <w:r>
+        <w:t xml:space="preserve"> </w:t>
+      </w:r>
+      <w:r>
+        <w:rPr>
+          <w:b/>
+        </w:rPr>
+        <w:t xml:space="preserve">[TRISA]</w:t>
+      </w:r>
+      <w:r>
+        <w:t xml:space="preserve"> </w:t>
+      </w:r>
+      <w:r>
+        <w:t xml:space="preserve">TRISA;</w:t>
+      </w:r>
+      <w:r>
+        <w:t xml:space="preserve"> </w:t>
+      </w:r>
+      <w:r>
+        <w:rPr>
+          <w:b/>
+        </w:rPr>
+        <w:t xml:space="preserve">[OpenVASP TRP]</w:t>
       </w:r>
       <w:r>
         <w:t xml:space="preserve"> </w:t>
@@ -10091,6 +10346,15 @@
         <w:pStyle w:val="Compact"/>
       </w:pPr>
       <w:r>
+        <w:rPr>
+          <w:b/>
+        </w:rPr>
+        <w:t xml:space="preserve">[EU AI Act]</w:t>
+      </w:r>
+      <w:r>
+        <w:t xml:space="preserve"> </w:t>
+      </w:r>
+      <w:r>
         <w:t xml:space="preserve">EU</w:t>
       </w:r>
       <w:r>
@@ -10106,7 +10370,28 @@
         <w:t xml:space="preserve"> </w:t>
       </w:r>
       <w:r>
-        <w:t xml:space="preserve">(Reg. 2024/1689), Article 14; US</w:t>
+        <w:t xml:space="preserve">(Reg. 2024/1689),</w:t>
+      </w:r>
+      <w:r>
+        <w:t xml:space="preserve"> </w:t>
+      </w:r>
+      <w:r>
+        <w:t xml:space="preserve">Article 14;</w:t>
+      </w:r>
+      <w:r>
+        <w:t xml:space="preserve"> </w:t>
+      </w:r>
+      <w:r>
+        <w:rPr>
+          <w:b/>
+        </w:rPr>
+        <w:t xml:space="preserve">[EO 14409]</w:t>
+      </w:r>
+      <w:r>
+        <w:t xml:space="preserve"> </w:t>
+      </w:r>
+      <w:r>
+        <w:t xml:space="preserve">US</w:t>
       </w:r>
       <w:r>
         <w:t xml:space="preserve"> </w:t>
@@ -10127,13 +10412,13 @@
         <w:t xml:space="preserve">“</w:t>
       </w:r>
       <w:r>
-        <w:t xml:space="preserve">Securing the Nation Against Advanced</w:t>
-      </w:r>
-      <w:r>
-        <w:t xml:space="preserve"> </w:t>
-      </w:r>
-      <w:r>
-        <w:t xml:space="preserve">Cryptographic Attacks</w:t>
+        <w:t xml:space="preserve">Securing the</w:t>
+      </w:r>
+      <w:r>
+        <w:t xml:space="preserve"> </w:t>
+      </w:r>
+      <w:r>
+        <w:t xml:space="preserve">Nation Against Advanced Cryptographic Attacks</w:t>
       </w:r>
       <w:r>
         <w:t xml:space="preserve">”</w:t>
@@ -10154,6 +10439,15 @@
         <w:pStyle w:val="Compact"/>
       </w:pPr>
       <w:r>
+        <w:rPr>
+          <w:b/>
+        </w:rPr>
+        <w:t xml:space="preserve">[Poseidon2]</w:t>
+      </w:r>
+      <w:r>
+        <w:t xml:space="preserve"> </w:t>
+      </w:r>
+      <w:r>
         <w:t xml:space="preserve">Grassi, Khovratovich, Roy, Schofnegger,</w:t>
       </w:r>
       <w:r>
@@ -10173,6 +10467,15 @@
       </w:r>
       <w:r>
         <w:rPr>
+          <w:b/>
+        </w:rPr>
+        <w:t xml:space="preserve">[LaBRADOR]</w:t>
+      </w:r>
+      <w:r>
+        <w:t xml:space="preserve"> </w:t>
+      </w:r>
+      <w:r>
+        <w:rPr>
           <w:i/>
         </w:rPr>
         <w:t xml:space="preserve">LaBRADOR</w:t>
@@ -10188,6 +10491,15 @@
       </w:r>
       <w:r>
         <w:rPr>
+          <w:b/>
+        </w:rPr>
+        <w:t xml:space="preserve">[Greyhound]</w:t>
+      </w:r>
+      <w:r>
+        <w:t xml:space="preserve"> </w:t>
+      </w:r>
+      <w:r>
+        <w:rPr>
           <w:i/>
         </w:rPr>
         <w:t xml:space="preserve">Greyhound</w:t>
@@ -10196,13 +10508,49 @@
         <w:t xml:space="preserve"> </w:t>
       </w:r>
       <w:r>
-        <w:t xml:space="preserve">(post-quantum lattice SNARKs); BBS+ signatures;</w:t>
-      </w:r>
-      <w:r>
-        <w:t xml:space="preserve"> </w:t>
-      </w:r>
-      <w:r>
-        <w:t xml:space="preserve">Hyperledger AnonCreds.</w:t>
+        <w:t xml:space="preserve">(post-quantum</w:t>
+      </w:r>
+      <w:r>
+        <w:t xml:space="preserve"> </w:t>
+      </w:r>
+      <w:r>
+        <w:t xml:space="preserve">lattice SNARKs);</w:t>
+      </w:r>
+      <w:r>
+        <w:t xml:space="preserve"> </w:t>
+      </w:r>
+      <w:r>
+        <w:rPr>
+          <w:b/>
+        </w:rPr>
+        <w:t xml:space="preserve">[BBS+]</w:t>
+      </w:r>
+      <w:r>
+        <w:t xml:space="preserve"> </w:t>
+      </w:r>
+      <w:r>
+        <w:t xml:space="preserve">BBS+ signatures;</w:t>
+      </w:r>
+      <w:r>
+        <w:t xml:space="preserve"> </w:t>
+      </w:r>
+      <w:r>
+        <w:rPr>
+          <w:b/>
+        </w:rPr>
+        <w:t xml:space="preserve">[AnonCreds]</w:t>
+      </w:r>
+      <w:r>
+        <w:t xml:space="preserve"> </w:t>
+      </w:r>
+      <w:r>
+        <w:t xml:space="preserve">Hyperledger</w:t>
+      </w:r>
+      <w:r>
+        <w:t xml:space="preserve"> </w:t>
+      </w:r>
+      <w:r>
+        <w:t xml:space="preserve">AnonCreds.</w:t>
       </w:r>
     </w:p>
     <w:p>
@@ -10214,7 +10562,16 @@
         <w:pStyle w:val="Compact"/>
       </w:pPr>
       <w:r>
-        <w:t xml:space="preserve">Chainlink</w:t>
+        <w:rPr>
+          <w:b/>
+        </w:rPr>
+        <w:t xml:space="preserve">[Groth16]</w:t>
+      </w:r>
+      <w:r>
+        <w:t xml:space="preserve"> </w:t>
+      </w:r>
+      <w:r>
+        <w:t xml:space="preserve">J. Groth,</w:t>
       </w:r>
       <w:r>
         <w:t xml:space="preserve"> </w:t>
@@ -10223,25 +10580,148 @@
         <w:rPr>
           <w:i/>
         </w:rPr>
-        <w:t xml:space="preserve">DECO</w:t>
-      </w:r>
-      <w:r>
-        <w:t xml:space="preserve">; ENS; Handshake; Namecoin; ICANN</w:t>
-      </w:r>
-      <w:r>
-        <w:t xml:space="preserve"> </w:t>
+        <w:t xml:space="preserve">On the Size of Pairing-Based Non-Interactive</w:t>
       </w:r>
       <w:r>
         <w:rPr>
           <w:i/>
         </w:rPr>
-        <w:t xml:space="preserve">OCTO-034</w:t>
-      </w:r>
-      <w:r>
-        <w:t xml:space="preserve"> </w:t>
-      </w:r>
-      <w:r>
-        <w:t xml:space="preserve">(alternative name systems).</w:t>
+        <w:t xml:space="preserve"> </w:t>
+      </w:r>
+      <w:r>
+        <w:rPr>
+          <w:i/>
+        </w:rPr>
+        <w:t xml:space="preserve">Arguments</w:t>
+      </w:r>
+      <w:r>
+        <w:t xml:space="preserve">, EUROCRYPT 2016;</w:t>
+      </w:r>
+      <w:r>
+        <w:t xml:space="preserve"> </w:t>
+      </w:r>
+      <w:r>
+        <w:rPr>
+          <w:b/>
+        </w:rPr>
+        <w:t xml:space="preserve">[PLONK]</w:t>
+      </w:r>
+      <w:r>
+        <w:t xml:space="preserve"> </w:t>
+      </w:r>
+      <w:r>
+        <w:t xml:space="preserve">Gabizon, Williamson, Ciobotaru,</w:t>
+      </w:r>
+      <w:r>
+        <w:t xml:space="preserve"> </w:t>
+      </w:r>
+      <w:r>
+        <w:rPr>
+          <w:i/>
+        </w:rPr>
+        <w:t xml:space="preserve">PLONK</w:t>
+      </w:r>
+      <w:r>
+        <w:t xml:space="preserve">, IACR ePrint 2019/953;</w:t>
+      </w:r>
+      <w:r>
+        <w:t xml:space="preserve"> </w:t>
+      </w:r>
+      <w:r>
+        <w:rPr>
+          <w:b/>
+        </w:rPr>
+        <w:t xml:space="preserve">[MiMC]</w:t>
+      </w:r>
+      <w:r>
+        <w:t xml:space="preserve"> </w:t>
+      </w:r>
+      <w:r>
+        <w:t xml:space="preserve">Albrecht, Grassi, Rechberger,</w:t>
+      </w:r>
+      <w:r>
+        <w:t xml:space="preserve"> </w:t>
+      </w:r>
+      <w:r>
+        <w:t xml:space="preserve">Roy, Tiessen,</w:t>
+      </w:r>
+      <w:r>
+        <w:t xml:space="preserve"> </w:t>
+      </w:r>
+      <w:r>
+        <w:rPr>
+          <w:i/>
+        </w:rPr>
+        <w:t xml:space="preserve">MiMC</w:t>
+      </w:r>
+      <w:r>
+        <w:t xml:space="preserve">, ASIACRYPT 2016;</w:t>
+      </w:r>
+      <w:r>
+        <w:t xml:space="preserve"> </w:t>
+      </w:r>
+      <w:r>
+        <w:rPr>
+          <w:b/>
+        </w:rPr>
+        <w:t xml:space="preserve">[BN254]</w:t>
+      </w:r>
+      <w:r>
+        <w:t xml:space="preserve"> </w:t>
+      </w:r>
+      <w:r>
+        <w:t xml:space="preserve">Barreto, Naehrig,</w:t>
+      </w:r>
+      <w:r>
+        <w:t xml:space="preserve"> </w:t>
+      </w:r>
+      <w:r>
+        <w:rPr>
+          <w:i/>
+        </w:rPr>
+        <w:t xml:space="preserve">Pairing-Friendly Elliptic Curves of Prime Order</w:t>
+      </w:r>
+      <w:r>
+        <w:t xml:space="preserve">, SAC 2005;</w:t>
+      </w:r>
+      <w:r>
+        <w:t xml:space="preserve"> </w:t>
+      </w:r>
+      <w:r>
+        <w:rPr>
+          <w:b/>
+        </w:rPr>
+        <w:t xml:space="preserve">[BLS12-381]</w:t>
+      </w:r>
+      <w:r>
+        <w:t xml:space="preserve"> </w:t>
+      </w:r>
+      <w:r>
+        <w:t xml:space="preserve">Bowe,</w:t>
+      </w:r>
+      <w:r>
+        <w:t xml:space="preserve"> </w:t>
+      </w:r>
+      <w:r>
+        <w:rPr>
+          <w:i/>
+        </w:rPr>
+        <w:t xml:space="preserve">BLS12-381: New zk-SNARK Elliptic Curve</w:t>
+      </w:r>
+      <w:r>
+        <w:rPr>
+          <w:i/>
+        </w:rPr>
+        <w:t xml:space="preserve"> </w:t>
+      </w:r>
+      <w:r>
+        <w:rPr>
+          <w:i/>
+        </w:rPr>
+        <w:t xml:space="preserve">Construction</w:t>
+      </w:r>
+      <w:r>
+        <w:t xml:space="preserve">, Zcash 2017.</w:t>
       </w:r>
     </w:p>
     <w:p>
@@ -10253,6 +10733,261 @@
         <w:pStyle w:val="Compact"/>
       </w:pPr>
       <w:r>
+        <w:rPr>
+          <w:b/>
+        </w:rPr>
+        <w:t xml:space="preserve">[Howey]</w:t>
+      </w:r>
+      <w:r>
+        <w:t xml:space="preserve"> </w:t>
+      </w:r>
+      <w:r>
+        <w:rPr>
+          <w:i/>
+        </w:rPr>
+        <w:t xml:space="preserve">SEC v. W. J. Howey Co.</w:t>
+      </w:r>
+      <w:r>
+        <w:t xml:space="preserve">, 328 U.S. 293 (1946);</w:t>
+      </w:r>
+      <w:r>
+        <w:t xml:space="preserve"> </w:t>
+      </w:r>
+      <w:r>
+        <w:rPr>
+          <w:b/>
+        </w:rPr>
+        <w:t xml:space="preserve">[MiCA]</w:t>
+      </w:r>
+      <w:r>
+        <w:t xml:space="preserve"> </w:t>
+      </w:r>
+      <w:r>
+        <w:t xml:space="preserve">Regulation (EU) 2023/1114 (Markets in Crypto-Assets);</w:t>
+      </w:r>
+      <w:r>
+        <w:t xml:space="preserve"> </w:t>
+      </w:r>
+      <w:r>
+        <w:rPr>
+          <w:b/>
+        </w:rPr>
+        <w:t xml:space="preserve">[FinCEN MSB]</w:t>
+      </w:r>
+      <w:r>
+        <w:t xml:space="preserve"> </w:t>
+      </w:r>
+      <w:r>
+        <w:t xml:space="preserve">FinCEN, 31 CFR Chapter X (money services businesses) and US state</w:t>
+      </w:r>
+      <w:r>
+        <w:t xml:space="preserve"> </w:t>
+      </w:r>
+      <w:r>
+        <w:t xml:space="preserve">money-transmitter licensing;</w:t>
+      </w:r>
+      <w:r>
+        <w:t xml:space="preserve"> </w:t>
+      </w:r>
+      <w:r>
+        <w:rPr>
+          <w:b/>
+        </w:rPr>
+        <w:t xml:space="preserve">[CIMA VASP]</w:t>
+      </w:r>
+      <w:r>
+        <w:t xml:space="preserve"> </w:t>
+      </w:r>
+      <w:r>
+        <w:t xml:space="preserve">Cayman Islands</w:t>
+      </w:r>
+      <w:r>
+        <w:t xml:space="preserve"> </w:t>
+      </w:r>
+      <w:r>
+        <w:rPr>
+          <w:i/>
+        </w:rPr>
+        <w:t xml:space="preserve">Virtual</w:t>
+      </w:r>
+      <w:r>
+        <w:rPr>
+          <w:i/>
+        </w:rPr>
+        <w:t xml:space="preserve"> </w:t>
+      </w:r>
+      <w:r>
+        <w:rPr>
+          <w:i/>
+        </w:rPr>
+        <w:t xml:space="preserve">Asset (Service Providers) Act</w:t>
+      </w:r>
+      <w:r>
+        <w:t xml:space="preserve"> </w:t>
+      </w:r>
+      <w:r>
+        <w:t xml:space="preserve">(2020), CIMA;</w:t>
+      </w:r>
+      <w:r>
+        <w:t xml:space="preserve"> </w:t>
+      </w:r>
+      <w:r>
+        <w:rPr>
+          <w:b/>
+        </w:rPr>
+        <w:t xml:space="preserve">[DNSSEC]</w:t>
+      </w:r>
+      <w:r>
+        <w:t xml:space="preserve"> </w:t>
+      </w:r>
+      <w:r>
+        <w:t xml:space="preserve">RFC</w:t>
+      </w:r>
+      <w:r>
+        <w:t xml:space="preserve"> </w:t>
+      </w:r>
+      <w:r>
+        <w:t xml:space="preserve">4033/4034/4035,</w:t>
+      </w:r>
+      <w:r>
+        <w:t xml:space="preserve"> </w:t>
+      </w:r>
+      <w:r>
+        <w:rPr>
+          <w:i/>
+        </w:rPr>
+        <w:t xml:space="preserve">DNS Security Extensions</w:t>
+      </w:r>
+      <w:r>
+        <w:t xml:space="preserve">.</w:t>
+      </w:r>
+    </w:p>
+    <w:p>
+      <w:pPr>
+        <w:numPr>
+          <w:ilvl w:val="0"/>
+          <w:numId w:val="1007"/>
+        </w:numPr>
+        <w:pStyle w:val="Compact"/>
+      </w:pPr>
+      <w:r>
+        <w:rPr>
+          <w:b/>
+        </w:rPr>
+        <w:t xml:space="preserve">[DECO]</w:t>
+      </w:r>
+      <w:r>
+        <w:t xml:space="preserve"> </w:t>
+      </w:r>
+      <w:r>
+        <w:t xml:space="preserve">Chainlink</w:t>
+      </w:r>
+      <w:r>
+        <w:t xml:space="preserve"> </w:t>
+      </w:r>
+      <w:r>
+        <w:rPr>
+          <w:i/>
+        </w:rPr>
+        <w:t xml:space="preserve">DECO</w:t>
+      </w:r>
+      <w:r>
+        <w:t xml:space="preserve">;</w:t>
+      </w:r>
+      <w:r>
+        <w:t xml:space="preserve"> </w:t>
+      </w:r>
+      <w:r>
+        <w:rPr>
+          <w:b/>
+        </w:rPr>
+        <w:t xml:space="preserve">[ENS]</w:t>
+      </w:r>
+      <w:r>
+        <w:t xml:space="preserve"> </w:t>
+      </w:r>
+      <w:r>
+        <w:t xml:space="preserve">ENS;</w:t>
+      </w:r>
+      <w:r>
+        <w:t xml:space="preserve"> </w:t>
+      </w:r>
+      <w:r>
+        <w:rPr>
+          <w:b/>
+        </w:rPr>
+        <w:t xml:space="preserve">[Handshake]</w:t>
+      </w:r>
+      <w:r>
+        <w:t xml:space="preserve"> </w:t>
+      </w:r>
+      <w:r>
+        <w:t xml:space="preserve">Handshake;</w:t>
+      </w:r>
+      <w:r>
+        <w:t xml:space="preserve"> </w:t>
+      </w:r>
+      <w:r>
+        <w:rPr>
+          <w:b/>
+        </w:rPr>
+        <w:t xml:space="preserve">[Namecoin]</w:t>
+      </w:r>
+      <w:r>
+        <w:t xml:space="preserve"> </w:t>
+      </w:r>
+      <w:r>
+        <w:t xml:space="preserve">Namecoin;</w:t>
+      </w:r>
+      <w:r>
+        <w:t xml:space="preserve"> </w:t>
+      </w:r>
+      <w:r>
+        <w:rPr>
+          <w:b/>
+        </w:rPr>
+        <w:t xml:space="preserve">[OCTO-034]</w:t>
+      </w:r>
+      <w:r>
+        <w:t xml:space="preserve"> </w:t>
+      </w:r>
+      <w:r>
+        <w:t xml:space="preserve">ICANN</w:t>
+      </w:r>
+      <w:r>
+        <w:t xml:space="preserve"> </w:t>
+      </w:r>
+      <w:r>
+        <w:rPr>
+          <w:i/>
+        </w:rPr>
+        <w:t xml:space="preserve">OCTO-034</w:t>
+      </w:r>
+      <w:r>
+        <w:t xml:space="preserve"> </w:t>
+      </w:r>
+      <w:r>
+        <w:t xml:space="preserve">(alternative name systems).</w:t>
+      </w:r>
+    </w:p>
+    <w:p>
+      <w:pPr>
+        <w:numPr>
+          <w:ilvl w:val="0"/>
+          <w:numId w:val="1007"/>
+        </w:numPr>
+        <w:pStyle w:val="Compact"/>
+      </w:pPr>
+      <w:r>
+        <w:rPr>
+          <w:b/>
+        </w:rPr>
+        <w:t xml:space="preserve">[SPT-Txn I-D]</w:t>
+      </w:r>
+      <w:r>
+        <w:t xml:space="preserve"> </w:t>
+      </w:r>
+      <w:r>
         <w:t xml:space="preserve">R. J. Coetzee,</w:t>
       </w:r>
       <w:r>
@@ -10265,7 +11000,13 @@
         <w:t xml:space="preserve">SPT-Txn Transaction Tokens</w:t>
       </w:r>
       <w:r>
-        <w:t xml:space="preserve">, IETF Internet-Draft</w:t>
+        <w:t xml:space="preserve">, IETF</w:t>
+      </w:r>
+      <w:r>
+        <w:t xml:space="preserve"> </w:t>
+      </w:r>
+      <w:r>
+        <w:t xml:space="preserve">Internet-Draft</w:t>
       </w:r>
       <w:r>
         <w:t xml:space="preserve"> </w:t>

</xml_diff>